<commit_message>
Ampliación del informe de arbolado: logos, mapa, árboles de la Avenida El Oro, fotos y URLs por árbol
- Incorpora logos institucionales (UNL y ArboLEC) en portada y oficio
- Añade mapa profesional georreferenciado (28 árboles) y espacio para fotos de campo en Metodología
- Integra 4 árboles de la isleta de la Avenida El Oro (AV01-AV04); total 28 árboles
- Marca AV02 (molle con pudrición del tronco) y AV04 (acacia vieja) para evaluación estructural/monitoreo
- Espacio para 3 fotos + URL de ficha ArboLEC por árbol (secciones 6 y 8)
- Refactor: módulo de datos compartido _data.py y generador de mapa

Co-Authored-By: Claude Fable 5 <noreply@anthropic.com>
Claude-Session: https://claude.ai/code/session_01442Fz9ZmmTFnvPw1BsonXT
</commit_message>
<xml_diff>
--- a/Estudio_Arbolado_Parque_Central_Saraguro/Oficio_Respuesta_GAD_Saraguro.docx
+++ b/Estudio_Arbolado_Parque_Central_Saraguro/Oficio_Respuesta_GAD_Saraguro.docx
@@ -2,6 +2,120 @@
 <file path=word/document.xml><?xml version="1.0" encoding="utf-8"?>
 <w:document xmlns:wpc="http://schemas.microsoft.com/office/word/2010/wordprocessingCanvas" xmlns:mo="http://schemas.microsoft.com/office/mac/office/2008/main" xmlns:mc="http://schemas.openxmlformats.org/markup-compatibility/2006" xmlns:mv="urn:schemas-microsoft-com:mac:vml" xmlns:o="urn:schemas-microsoft-com:office:office" xmlns:r="http://schemas.openxmlformats.org/officeDocument/2006/relationships" xmlns:m="http://schemas.openxmlformats.org/officeDocument/2006/math" xmlns:v="urn:schemas-microsoft-com:vml" xmlns:wp14="http://schemas.microsoft.com/office/word/2010/wordprocessingDrawing" xmlns:wp="http://schemas.openxmlformats.org/drawingml/2006/wordprocessingDrawing" xmlns:w10="urn:schemas-microsoft-com:office:word" xmlns:w="http://schemas.openxmlformats.org/wordprocessingml/2006/main" xmlns:w14="http://schemas.microsoft.com/office/word/2010/wordml" xmlns:wpg="http://schemas.microsoft.com/office/word/2010/wordprocessingGroup" xmlns:wpi="http://schemas.microsoft.com/office/word/2010/wordprocessingInk" xmlns:wne="http://schemas.microsoft.com/office/word/2006/wordml" xmlns:wps="http://schemas.microsoft.com/office/word/2010/wordprocessingShape" mc:Ignorable="w14 wp14">
   <w:body>
+    <w:tbl>
+      <w:tblPr>
+        <w:tblW w:type="auto" w:w="0"/>
+        <w:jc w:val="center"/>
+        <w:tblLook w:firstColumn="1" w:firstRow="1" w:lastColumn="0" w:lastRow="0" w:noHBand="0" w:noVBand="1" w:val="04A0"/>
+      </w:tblPr>
+      <w:tblGrid>
+        <w:gridCol w:w="4703"/>
+        <w:gridCol w:w="4703"/>
+      </w:tblGrid>
+      <w:tr>
+        <w:tc>
+          <w:tcPr>
+            <w:tcW w:type="dxa" w:w="4703"/>
+          </w:tcPr>
+          <w:p>
+            <w:pPr>
+              <w:jc w:val="left"/>
+            </w:pPr>
+            <w:r>
+              <w:drawing>
+                <wp:inline xmlns:a="http://schemas.openxmlformats.org/drawingml/2006/main" xmlns:pic="http://schemas.openxmlformats.org/drawingml/2006/picture">
+                  <wp:extent cx="2340000" cy="747604"/>
+                  <wp:docPr id="1" name="Picture 1"/>
+                  <wp:cNvGraphicFramePr>
+                    <a:graphicFrameLocks noChangeAspect="1"/>
+                  </wp:cNvGraphicFramePr>
+                  <a:graphic>
+                    <a:graphicData uri="http://schemas.openxmlformats.org/drawingml/2006/picture">
+                      <pic:pic>
+                        <pic:nvPicPr>
+                          <pic:cNvPr id="0" name="LOGO_UNL.png"/>
+                          <pic:cNvPicPr/>
+                        </pic:nvPicPr>
+                        <pic:blipFill>
+                          <a:blip r:embed="rId9"/>
+                          <a:stretch>
+                            <a:fillRect/>
+                          </a:stretch>
+                        </pic:blipFill>
+                        <pic:spPr>
+                          <a:xfrm>
+                            <a:off x="0" y="0"/>
+                            <a:ext cx="2340000" cy="747604"/>
+                          </a:xfrm>
+                          <a:prstGeom prst="rect"/>
+                        </pic:spPr>
+                      </pic:pic>
+                    </a:graphicData>
+                  </a:graphic>
+                </wp:inline>
+              </w:drawing>
+            </w:r>
+          </w:p>
+        </w:tc>
+        <w:tc>
+          <w:tcPr>
+            <w:tcW w:type="dxa" w:w="4703"/>
+          </w:tcPr>
+          <w:p>
+            <w:pPr>
+              <w:jc w:val="right"/>
+            </w:pPr>
+            <w:r>
+              <w:drawing>
+                <wp:inline xmlns:a="http://schemas.openxmlformats.org/drawingml/2006/main" xmlns:pic="http://schemas.openxmlformats.org/drawingml/2006/picture">
+                  <wp:extent cx="864000" cy="865305"/>
+                  <wp:docPr id="2" name="Picture 2"/>
+                  <wp:cNvGraphicFramePr>
+                    <a:graphicFrameLocks noChangeAspect="1"/>
+                  </wp:cNvGraphicFramePr>
+                  <a:graphic>
+                    <a:graphicData uri="http://schemas.openxmlformats.org/drawingml/2006/picture">
+                      <pic:pic>
+                        <pic:nvPicPr>
+                          <pic:cNvPr id="0" name="ArbolEC.jpeg"/>
+                          <pic:cNvPicPr/>
+                        </pic:nvPicPr>
+                        <pic:blipFill>
+                          <a:blip r:embed="rId10"/>
+                          <a:stretch>
+                            <a:fillRect/>
+                          </a:stretch>
+                        </pic:blipFill>
+                        <pic:spPr>
+                          <a:xfrm>
+                            <a:off x="0" y="0"/>
+                            <a:ext cx="864000" cy="865305"/>
+                          </a:xfrm>
+                          <a:prstGeom prst="rect"/>
+                        </pic:spPr>
+                      </pic:pic>
+                    </a:graphicData>
+                  </a:graphic>
+                </wp:inline>
+              </w:drawing>
+            </w:r>
+          </w:p>
+        </w:tc>
+      </w:tr>
+    </w:tbl>
+    <w:p>
+      <w:pPr>
+        <w:spacing w:after="40" w:before="0"/>
+        <w:jc w:val="both"/>
+      </w:pPr>
+      <w:r>
+        <w:rPr>
+          <w:b w:val="0"/>
+          <w:i w:val="0"/>
+          <w:sz w:val="22"/>
+        </w:rPr>
+      </w:r>
+    </w:p>
     <w:p>
       <w:pPr>
         <w:spacing w:after="0" w:before="0"/>
@@ -12,14 +126,14 @@
           <w:b/>
           <w:i w:val="0"/>
           <w:color w:val="1B5E20"/>
-          <w:sz w:val="26"/>
+          <w:sz w:val="25"/>
         </w:rPr>
         <w:t>UNIVERSIDAD NACIONAL DE LOJA</w:t>
       </w:r>
     </w:p>
     <w:p>
       <w:pPr>
-        <w:spacing w:after="0" w:before="0"/>
+        <w:spacing w:after="240" w:before="0"/>
         <w:jc w:val="center"/>
       </w:pPr>
       <w:r>
@@ -27,24 +141,9 @@
           <w:b w:val="0"/>
           <w:i w:val="0"/>
           <w:color w:val="424242"/>
-          <w:sz w:val="21"/>
+          <w:sz w:val="19"/>
         </w:rPr>
-        <w:t>Laboratorio de Dendrocronología y Anatomía de la Madera</w:t>
-      </w:r>
-    </w:p>
-    <w:p>
-      <w:pPr>
-        <w:spacing w:after="280" w:before="0"/>
-        <w:jc w:val="center"/>
-      </w:pPr>
-      <w:r>
-        <w:rPr>
-          <w:b w:val="0"/>
-          <w:i w:val="0"/>
-          <w:color w:val="424242"/>
-          <w:sz w:val="21"/>
-        </w:rPr>
-        <w:t>Facultad Agropecuaria y de Recursos Naturales Renovables</w:t>
+        <w:t>Laboratorio de Dendrocronología y Anatomía de la Madera · Facultad Agropecuaria y de Recursos Naturales Renovables</w:t>
       </w:r>
     </w:p>
     <w:p>
@@ -63,7 +162,7 @@
     </w:p>
     <w:p>
       <w:pPr>
-        <w:spacing w:after="280" w:before="0"/>
+        <w:spacing w:after="240" w:before="0"/>
         <w:jc w:val="right"/>
       </w:pPr>
       <w:r>
@@ -185,7 +284,7 @@
           <w:i w:val="0"/>
           <w:sz w:val="22"/>
         </w:rPr>
-        <w:t>Reciba un cordial saludo. En atención a su Oficio Nro. 0286-A-GADMIS y a la autorización conferida por el señor Rector de la Universidad Nacional de Loja mediante Memorando Nro. UNL-R-2026-2083-M, me permito remitir a usted el Informe Técnico de Evaluación del Arbolado Urbano del Parque Central del cantón Saraguro, con el criterio especializado solicitado sobre el estado actual de los árboles y su eventual conservación o derribo.</w:t>
+        <w:t>Reciba un cordial saludo. En atención a su Oficio Nro. 0286-A-GADMIS y a la autorización conferida por el señor Rector mediante Memorando Nro. UNL-R-2026-2083-M, me permito remitir el Informe Técnico de Evaluación del Arbolado Urbano del Parque Central del cantón Saraguro, con el criterio especializado solicitado sobre el estado actual de los árboles y su eventual conservación o derribo.</w:t>
       </w:r>
     </w:p>
     <w:p>
@@ -199,7 +298,7 @@
           <w:i w:val="0"/>
           <w:sz w:val="22"/>
         </w:rPr>
-        <w:t>El estudio comprendió el inventario y diagnóstico dendrométrico, fitosanitario y de riesgo de 24 árboles, sistematizado y publicado en la plataforma institucional ArboLEC (https://arbolec.unl.edu.ec/ec/Saraguro), disponible para consulta pública del Municipio y la ciudadanía. La evaluación atendió de manera particular a los cipreses del parque —por su valor patrimonial y por ser objeto expreso de su preocupación— y al riesgo de caída frente a las condiciones de viento de la zona.</w:t>
+        <w:t>El estudio comprendió el inventario y diagnóstico dendrométrico, fitosanitario y de riesgo de 28 árboles (24 en el Parque Central y 4 en la isleta de la Avenida El Oro), sistematizado y publicado en la plataforma institucional ArboLEC (https://arbolec.unl.edu.ec/ec/Saraguro), disponible para consulta pública. La evaluación atendió de manera particular a los cipreses del parque y al riesgo de caída frente a las condiciones de viento de la zona.</w:t>
       </w:r>
     </w:p>
     <w:p>
@@ -224,7 +323,7 @@
         <w:rPr>
           <w:sz w:val="22"/>
         </w:rPr>
-        <w:t>Se recomienda el DERRIBO de UN (1) solo árbol: el ciprés común (Hesperocyparis macrocarpa) ubicado junto a los baños, identificado como A06 (código 67829QG6+WJG5). Es el árbol de mayor porte del parque (27,1 m de altura; 118,2 cm de diámetro), el único con riesgo de caída ALTO, con exudados de resina y copa amplia y poco simétrica que, ante los fuertes vientos y su cercanía a una zona de alta concurrencia, representa un riesgo inaceptable para las personas.</w:t>
+        <w:t>Se recomienda el DERRIBO de UN (1) solo árbol: el ciprés común (Hesperocyparis macrocarpa) ubicado junto a los baños, identificado como A06 (código 67829QG6+WJG5). Es el de mayor porte del parque (27,1 m; 118,2 cm de diámetro), el único con riesgo de caída ALTO, con exudados de resina y copa amplia y poco simétrica que, ante los fuertes vientos y su cercanía a una zona de alta concurrencia, representa un riesgo inaceptable para las personas.</w:t>
       </w:r>
     </w:p>
     <w:p>
@@ -235,7 +334,7 @@
         <w:rPr>
           <w:sz w:val="22"/>
         </w:rPr>
-        <w:t>Se recomienda CONSERVAR los 23 árboles restantes, incluidos los demás cipreses patrimoniales, mediante intervenciones de manejo: poda sanitaria y de reequilibrio, tratamiento fitosanitario, manejo de raíces y monitoreo de los ejemplares inclinados o con anclaje comprometido.</w:t>
+        <w:t>Se recomienda CONSERVAR los 27 árboles restantes, incluidos los demás cipreses patrimoniales, mediante manejo: poda sanitaria y de reequilibrio, tratamiento fitosanitario, manejo de raíces y monitoreo de los ejemplares inclinados o con anclaje comprometido.</w:t>
       </w:r>
     </w:p>
     <w:p>
@@ -246,7 +345,18 @@
         <w:rPr>
           <w:sz w:val="22"/>
         </w:rPr>
-        <w:t>El daño al adoquinado y a las estructuras de concreto por raíces —que motivó su solicitud— se atiende con manejo de raíces (barreras físicas y reparación del adoquín) sin necesidad de talar árboles estructuralmente sanos.</w:t>
+        <w:t>En la isleta de la Avenida El Oro, dos árboles requieren evaluación estructural y monitoreo prioritario (sin ser derribo): un molle con pudrición del tronco (AV02) y una acacia vieja con raíz y fuste en mal estado (AV04).</w:t>
+      </w:r>
+    </w:p>
+    <w:p>
+      <w:pPr>
+        <w:pStyle w:val="ListBullet"/>
+      </w:pPr>
+      <w:r>
+        <w:rPr>
+          <w:sz w:val="22"/>
+        </w:rPr>
+        <w:t>El daño al adoquinado y al concreto por raíces —que motivó su solicitud— se atiende con manejo de raíces (barreras y reparación) sin necesidad de talar árboles estructuralmente sanos.</w:t>
       </w:r>
     </w:p>
     <w:p>
@@ -260,7 +370,7 @@
           <w:i w:val="0"/>
           <w:sz w:val="22"/>
         </w:rPr>
-        <w:t>Debo señalar, con la objetividad que exige este tipo de pronunciamiento, que la recomendación de derribo se ha emitido con criterio restrictivo: únicamente cuando la evidencia técnica demuestra un riesgo real e irreversible para la seguridad ciudadana. De esta manera se protege tanto a la población como el patrimonio arbóreo que caracteriza al Parque Central de Saraguro. Para el árbol A06 se sugiere, de ser posible, una verificación instrumental previa (resistógrafo o tomografía sónica) y su derribo por personal especializado con las debidas medidas de seguridad.</w:t>
+        <w:t>Debo señalar, con la objetividad que exige este pronunciamiento, que la recomendación de derribo se ha emitido con criterio restrictivo: únicamente cuando la evidencia técnica demuestra un riesgo real e irreversible para la seguridad ciudadana, protegiendo así tanto a la población como el patrimonio arbóreo del Parque Central. Para el árbol A06 se sugiere, de ser posible, una verificación instrumental previa (resistógrafo o tomografía sónica) y su derribo por personal especializado con las debidas medidas de seguridad.</w:t>
       </w:r>
     </w:p>
     <w:p>
@@ -274,7 +384,7 @@
           <w:i w:val="0"/>
           <w:sz w:val="22"/>
         </w:rPr>
-        <w:t>El detalle por árbol, el fundamento de cada veredicto, la tabla resumen de conservación y derribo y el registro fotográfico constan en el informe técnico que se adjunta. Quedo a disposición del Municipio para socializar los resultados y acompañar técnicamente las acciones que se deriven.</w:t>
+        <w:t>El detalle por árbol, el fundamento de cada veredicto, el mapa de ubicación, la tabla resumen de conservación y derribo y el registro fotográfico constan en el informe adjunto. Quedo a disposición del Municipio para socializar los resultados y acompañar técnicamente las acciones que se deriven.</w:t>
       </w:r>
     </w:p>
     <w:p>
@@ -375,7 +485,7 @@
           <w:color w:val="424242"/>
           <w:sz w:val="20"/>
         </w:rPr>
-        <w:t>Adjunto: Informe Técnico de Evaluación del Arbolado del Parque Central de Saraguro.</w:t>
+        <w:t>Adjunto: Informe Técnico de Evaluación del Arbolado del Parque Central y Avenida El Oro de Saraguro.</w:t>
       </w:r>
     </w:p>
     <w:p>
@@ -395,7 +505,7 @@
     </w:p>
     <w:sectPr>
       <w:pgSz w:w="12240" w:h="15840"/>
-      <w:pgMar w:top="1247" w:right="1417" w:bottom="1134" w:left="1417" w:header="720" w:footer="720" w:gutter="0"/>
+      <w:pgMar w:top="1020" w:right="1417" w:bottom="1134" w:left="1417" w:header="720" w:footer="720" w:gutter="0"/>
       <w:cols w:space="720"/>
       <w:docGrid w:linePitch="360"/>
     </w:sectPr>

</xml_diff>